<commit_message>
feat(rh): nouveau modèle Contrat CDI - Salaire > SMIG (Word fourni)
Remplace cdi_salaire_template.docx. Ajoute les variables {DATE DEBUT DE TRAVAIL}
(= date d'effet) et {DATE AUJOURD'HUI} (= date du jour). {NOM} = nom de famille
pour les contrats. Autres variables ({PRENOM},{CIN},{SALAIRE},{ADRESSE},{NATIONALITE}) déjà gérées.

Co-Authored-By: Claude Opus 4.8 (1M context) <noreply@anthropic.com>
</commit_message>
<xml_diff>
--- a/public/hr_modeles/cdi_salaire_template.docx
+++ b/public/hr_modeles/cdi_salaire_template.docx
@@ -214,15 +214,27 @@
       </w:r>
       <w:r>
         <w:rPr>
-          <w:rFonts w:ascii="Sakkal Majalla" w:hAnsi="Sakkal Majalla" w:cs="Sakkal Majalla" w:hint="cs"/>
-          <w:b/>
-          <w:bCs/>
-          <w:sz w:val="32"/>
-          <w:szCs w:val="32"/>
-          <w:rtl/>
-          <w:lang w:bidi="ar-MA"/>
-        </w:rPr>
-        <w:t xml:space="preserve">"     </w:t>
+          <w:rFonts w:ascii="Sakkal Majalla" w:hAnsi="Sakkal Majalla" w:cs="Sakkal Majalla"/>
+          <w:b/>
+          <w:bCs/>
+          <w:color w:val="0070C0"/>
+          <w:sz w:val="36"/>
+          <w:szCs w:val="36"/>
+          <w:lang w:bidi="ar-MA"/>
+        </w:rPr>
+        <w:t xml:space="preserve"> </w:t>
+      </w:r>
+      <w:r>
+        <w:rPr>
+          <w:rFonts w:ascii="Sakkal Majalla" w:hAnsi="Sakkal Majalla" w:cs="Sakkal Majalla" w:hint="cs"/>
+          <w:b/>
+          <w:bCs/>
+          <w:sz w:val="32"/>
+          <w:szCs w:val="32"/>
+          <w:rtl/>
+          <w:lang w:bidi="ar-MA"/>
+        </w:rPr>
+        <w:t xml:space="preserve">" </w:t>
       </w:r>
       <w:r>
         <w:rPr>
@@ -278,7 +290,7 @@
           <w:rtl/>
           <w:lang w:bidi="ar-MA"/>
         </w:rPr>
-        <w:t xml:space="preserve">  "  </w:t>
+        <w:t xml:space="preserve">  " </w:t>
       </w:r>
       <w:r>
         <w:rPr>
@@ -327,7 +339,7 @@
       </w:r>
       <w:r>
         <w:rPr>
-          <w:rFonts w:ascii="Sakkal Majalla" w:hAnsi="Sakkal Majalla" w:cs="Sakkal Majalla"/>
+          <w:rFonts w:ascii="Sakkal Majalla" w:hAnsi="Sakkal Majalla" w:hint="cs"/>
           <w:b/>
           <w:bCs/>
           <w:color w:val="0070C0"/>
@@ -336,19 +348,67 @@
           <w:rtl/>
           <w:lang w:bidi="ar-MA"/>
         </w:rPr>
+        <w:t> </w:t>
+      </w:r>
+      <w:r>
+        <w:rPr>
+          <w:rFonts w:ascii="Sakkal Majalla" w:hAnsi="Sakkal Majalla" w:cs="Sakkal Majalla"/>
+          <w:b/>
+          <w:bCs/>
+          <w:color w:val="0070C0"/>
+          <w:sz w:val="36"/>
+          <w:szCs w:val="36"/>
+          <w:lang w:bidi="ar-MA"/>
+        </w:rPr>
         <w:t>:</w:t>
       </w:r>
       <w:r>
         <w:rPr>
-          <w:rFonts w:ascii="Sakkal Majalla" w:hAnsi="Sakkal Majalla" w:cs="Sakkal Majalla" w:hint="cs"/>
-          <w:b/>
-          <w:bCs/>
-          <w:sz w:val="32"/>
-          <w:szCs w:val="32"/>
-          <w:rtl/>
-          <w:lang w:bidi="ar-MA"/>
-        </w:rPr>
-        <w:t>6 زنقة سمية أكدال الرباط</w:t>
+          <w:rFonts w:ascii="Sakkal Majalla" w:hAnsi="Sakkal Majalla" w:hint="cs"/>
+          <w:b/>
+          <w:bCs/>
+          <w:color w:val="0070C0"/>
+          <w:sz w:val="36"/>
+          <w:szCs w:val="36"/>
+          <w:rtl/>
+          <w:lang w:bidi="ar-MA"/>
+        </w:rPr>
+        <w:t> </w:t>
+      </w:r>
+      <w:r>
+        <w:rPr>
+          <w:rFonts w:ascii="Sakkal Majalla" w:hAnsi="Sakkal Majalla" w:cs="Sakkal Majalla" w:hint="cs"/>
+          <w:b/>
+          <w:bCs/>
+          <w:sz w:val="32"/>
+          <w:szCs w:val="32"/>
+          <w:rtl/>
+          <w:lang w:bidi="ar-MA"/>
+        </w:rPr>
+        <w:t>6</w:t>
+      </w:r>
+      <w:r>
+        <w:rPr>
+          <w:rFonts w:ascii="Sakkal Majalla" w:hAnsi="Sakkal Majalla" w:cs="Sakkal Majalla"/>
+          <w:b/>
+          <w:bCs/>
+          <w:sz w:val="32"/>
+          <w:szCs w:val="32"/>
+          <w:lang w:bidi="ar-MA"/>
+        </w:rPr>
+        <w:t xml:space="preserve"> </w:t>
+      </w:r>
+      <w:r>
+        <w:rPr>
+          <w:rFonts w:ascii="Sakkal Majalla" w:hAnsi="Sakkal Majalla" w:cs="Sakkal Majalla" w:hint="cs"/>
+          <w:b/>
+          <w:bCs/>
+          <w:sz w:val="32"/>
+          <w:szCs w:val="32"/>
+          <w:rtl/>
+          <w:lang w:bidi="ar-MA"/>
+        </w:rPr>
+        <w:t>زنقة سمية أكدال الرباط</w:t>
       </w:r>
       <w:r>
         <w:rPr>
@@ -362,6 +422,22 @@
         </w:rPr>
         <w:t>.</w:t>
       </w:r>
+    </w:p>
+    <w:p>
+      <w:pPr>
+        <w:pStyle w:val="Paragraphedeliste"/>
+        <w:bidi/>
+        <w:ind w:left="283"/>
+        <w:jc w:val="both"/>
+        <w:rPr>
+          <w:rFonts w:ascii="Sakkal Majalla" w:hAnsi="Sakkal Majalla" w:cs="Sakkal Majalla"/>
+          <w:b/>
+          <w:bCs/>
+          <w:sz w:val="32"/>
+          <w:szCs w:val="32"/>
+          <w:lang w:bidi="ar-MA"/>
+        </w:rPr>
+      </w:pPr>
     </w:p>
     <w:p>
       <w:pPr>
@@ -446,6 +522,18 @@
           <w:lang w:bidi="ar-MA"/>
         </w:rPr>
         <w:t>:</w:t>
+      </w:r>
+      <w:r>
+        <w:rPr>
+          <w:rFonts w:ascii="Sakkal Majalla" w:hAnsi="Sakkal Majalla" w:cs="Sakkal Majalla"/>
+          <w:b/>
+          <w:bCs/>
+          <w:color w:val="0070C0"/>
+          <w:sz w:val="36"/>
+          <w:szCs w:val="36"/>
+          <w:lang w:bidi="ar-MA"/>
+        </w:rPr>
+        <w:t xml:space="preserve">  </w:t>
       </w:r>
     </w:p>
     <w:p>
@@ -493,7 +581,18 @@
           <w:rtl/>
           <w:lang w:bidi="ar-MA"/>
         </w:rPr>
-        <w:t>الإسم العائلي:  {NOM_FAMILLE}</w:t>
+        <w:t xml:space="preserve">الإسم العائلي:  </w:t>
+      </w:r>
+      <w:r>
+        <w:rPr>
+          <w:rFonts w:ascii="Sakkal Majalla" w:hAnsi="Sakkal Majalla" w:cs="Sakkal Majalla"/>
+          <w:b/>
+          <w:bCs/>
+          <w:sz w:val="32"/>
+          <w:szCs w:val="32"/>
+          <w:lang w:bidi="ar-MA"/>
+        </w:rPr>
+        <w:t>{NOM}</w:t>
       </w:r>
     </w:p>
     <w:p>
@@ -526,7 +625,40 @@
           <w:rtl/>
           <w:lang w:bidi="ar-MA"/>
         </w:rPr>
-        <w:t>الإسم الشخصي:  {PRENOM}</w:t>
+        <w:t xml:space="preserve">الإسم الشخصي:  </w:t>
+      </w:r>
+      <w:r>
+        <w:rPr>
+          <w:rFonts w:ascii="Sakkal Majalla" w:hAnsi="Sakkal Majalla" w:cs="Sakkal Majalla"/>
+          <w:b/>
+          <w:bCs/>
+          <w:sz w:val="32"/>
+          <w:szCs w:val="32"/>
+          <w:lang w:bidi="ar-MA"/>
+        </w:rPr>
+        <w:t>{</w:t>
+      </w:r>
+      <w:r>
+        <w:rPr>
+          <w:rFonts w:ascii="Sakkal Majalla" w:hAnsi="Sakkal Majalla" w:cs="Sakkal Majalla"/>
+          <w:b/>
+          <w:bCs/>
+          <w:sz w:val="32"/>
+          <w:szCs w:val="32"/>
+          <w:lang w:bidi="ar-MA"/>
+        </w:rPr>
+        <w:t>PRENOM</w:t>
+      </w:r>
+      <w:r>
+        <w:rPr>
+          <w:rFonts w:ascii="Sakkal Majalla" w:hAnsi="Sakkal Majalla" w:cs="Sakkal Majalla"/>
+          <w:b/>
+          <w:bCs/>
+          <w:sz w:val="32"/>
+          <w:szCs w:val="32"/>
+          <w:lang w:bidi="ar-MA"/>
+        </w:rPr>
+        <w:t>}</w:t>
       </w:r>
     </w:p>
     <w:p>
@@ -560,7 +692,40 @@
           <w:rtl/>
           <w:lang w:bidi="ar-MA"/>
         </w:rPr>
-        <w:t>بطاقة التعريف الوطنية رقم:  {CIN}</w:t>
+        <w:t xml:space="preserve">بطاقة التعريف الوطنية رقم:  </w:t>
+      </w:r>
+      <w:r>
+        <w:rPr>
+          <w:rFonts w:ascii="Sakkal Majalla" w:hAnsi="Sakkal Majalla" w:cs="Sakkal Majalla"/>
+          <w:b/>
+          <w:bCs/>
+          <w:sz w:val="32"/>
+          <w:szCs w:val="32"/>
+          <w:lang w:bidi="ar-MA"/>
+        </w:rPr>
+        <w:t>{</w:t>
+      </w:r>
+      <w:r>
+        <w:rPr>
+          <w:rFonts w:ascii="Sakkal Majalla" w:hAnsi="Sakkal Majalla" w:cs="Sakkal Majalla"/>
+          <w:b/>
+          <w:bCs/>
+          <w:sz w:val="32"/>
+          <w:szCs w:val="32"/>
+          <w:lang w:bidi="ar-MA"/>
+        </w:rPr>
+        <w:t>CIN</w:t>
+      </w:r>
+      <w:r>
+        <w:rPr>
+          <w:rFonts w:ascii="Sakkal Majalla" w:hAnsi="Sakkal Majalla" w:cs="Sakkal Majalla"/>
+          <w:b/>
+          <w:bCs/>
+          <w:sz w:val="32"/>
+          <w:szCs w:val="32"/>
+          <w:lang w:bidi="ar-MA"/>
+        </w:rPr>
+        <w:t>}</w:t>
       </w:r>
     </w:p>
     <w:p>
@@ -594,7 +759,40 @@
           <w:rtl/>
           <w:lang w:bidi="ar-MA"/>
         </w:rPr>
-        <w:t>الجنسية:  {NATIONALITE}</w:t>
+        <w:t xml:space="preserve">الجنسية:  </w:t>
+      </w:r>
+      <w:r>
+        <w:rPr>
+          <w:rFonts w:ascii="Sakkal Majalla" w:hAnsi="Sakkal Majalla" w:cs="Sakkal Majalla"/>
+          <w:b/>
+          <w:bCs/>
+          <w:sz w:val="32"/>
+          <w:szCs w:val="32"/>
+          <w:lang w:bidi="ar-MA"/>
+        </w:rPr>
+        <w:t>{N</w:t>
+      </w:r>
+      <w:r>
+        <w:rPr>
+          <w:rFonts w:ascii="Sakkal Majalla" w:hAnsi="Sakkal Majalla" w:cs="Sakkal Majalla"/>
+          <w:b/>
+          <w:bCs/>
+          <w:sz w:val="32"/>
+          <w:szCs w:val="32"/>
+          <w:lang w:bidi="ar-MA"/>
+        </w:rPr>
+        <w:t>ATIONALITE</w:t>
+      </w:r>
+      <w:r>
+        <w:rPr>
+          <w:rFonts w:ascii="Sakkal Majalla" w:hAnsi="Sakkal Majalla" w:cs="Sakkal Majalla"/>
+          <w:b/>
+          <w:bCs/>
+          <w:sz w:val="32"/>
+          <w:szCs w:val="32"/>
+          <w:lang w:bidi="ar-MA"/>
+        </w:rPr>
+        <w:t>}</w:t>
       </w:r>
     </w:p>
     <w:p>
@@ -627,8 +825,66 @@
           <w:rtl/>
           <w:lang w:bidi="ar-MA"/>
         </w:rPr>
-        <w:t>العنوان:  {ADRESSE}</w:t>
-      </w:r>
+        <w:t xml:space="preserve">العنوان: </w:t>
+      </w:r>
+      <w:r>
+        <w:rPr>
+          <w:rFonts w:ascii="Sakkal Majalla" w:hAnsi="Sakkal Majalla" w:cs="Sakkal Majalla"/>
+          <w:b/>
+          <w:bCs/>
+          <w:sz w:val="32"/>
+          <w:szCs w:val="32"/>
+          <w:lang w:bidi="ar-MA"/>
+        </w:rPr>
+        <w:t>{</w:t>
+      </w:r>
+      <w:r>
+        <w:rPr>
+          <w:rFonts w:ascii="Sakkal Majalla" w:hAnsi="Sakkal Majalla" w:cs="Sakkal Majalla"/>
+          <w:b/>
+          <w:bCs/>
+          <w:sz w:val="32"/>
+          <w:szCs w:val="32"/>
+          <w:lang w:bidi="ar-MA"/>
+        </w:rPr>
+        <w:t>ADRESSE</w:t>
+      </w:r>
+      <w:r>
+        <w:rPr>
+          <w:rFonts w:ascii="Sakkal Majalla" w:hAnsi="Sakkal Majalla" w:cs="Sakkal Majalla"/>
+          <w:b/>
+          <w:bCs/>
+          <w:sz w:val="32"/>
+          <w:szCs w:val="32"/>
+          <w:lang w:bidi="ar-MA"/>
+        </w:rPr>
+        <w:t>}</w:t>
+      </w:r>
+      <w:r>
+        <w:rPr>
+          <w:rFonts w:ascii="Sakkal Majalla" w:hAnsi="Sakkal Majalla" w:cs="Sakkal Majalla"/>
+          <w:b/>
+          <w:bCs/>
+          <w:sz w:val="32"/>
+          <w:szCs w:val="32"/>
+          <w:lang w:bidi="ar-MA"/>
+        </w:rPr>
+        <w:t xml:space="preserve"> </w:t>
+      </w:r>
+    </w:p>
+    <w:p>
+      <w:pPr>
+        <w:bidi/>
+        <w:ind w:left="720"/>
+        <w:jc w:val="both"/>
+        <w:rPr>
+          <w:rFonts w:ascii="Sakkal Majalla" w:hAnsi="Sakkal Majalla" w:cs="Sakkal Majalla"/>
+          <w:sz w:val="32"/>
+          <w:szCs w:val="32"/>
+          <w:rtl/>
+          <w:lang w:bidi="ar-MA"/>
+        </w:rPr>
+      </w:pPr>
     </w:p>
     <w:p>
       <w:pPr>
@@ -636,12 +892,40 @@
         <w:jc w:val="center"/>
         <w:rPr>
           <w:rFonts w:ascii="Sakkal Majalla" w:hAnsi="Sakkal Majalla" w:cs="Sakkal Majalla"/>
-          <w:sz w:val="10"/>
-          <w:szCs w:val="10"/>
-          <w:rtl/>
-          <w:lang w:bidi="ar-MA"/>
-        </w:rPr>
-      </w:pPr>
+          <w:b/>
+          <w:bCs/>
+          <w:color w:val="0070C0"/>
+          <w:sz w:val="36"/>
+          <w:szCs w:val="36"/>
+          <w:lang w:bidi="ar-MA"/>
+        </w:rPr>
+      </w:pPr>
+      <w:r>
+        <w:rPr>
+          <w:rFonts w:ascii="Sakkal Majalla" w:hAnsi="Sakkal Majalla" w:cs="Sakkal Majalla"/>
+          <w:b/>
+          <w:bCs/>
+          <w:color w:val="0070C0"/>
+          <w:sz w:val="36"/>
+          <w:szCs w:val="36"/>
+          <w:rtl/>
+          <w:lang w:bidi="ar-MA"/>
+        </w:rPr>
+        <w:t>طرف ثاني</w:t>
+      </w:r>
+      <w:r>
+        <w:rPr>
+          <w:rFonts w:ascii="Sakkal Majalla" w:hAnsi="Sakkal Majalla" w:cs="Sakkal Majalla" w:hint="cs"/>
+          <w:b/>
+          <w:bCs/>
+          <w:color w:val="0070C0"/>
+          <w:sz w:val="36"/>
+          <w:szCs w:val="36"/>
+          <w:rtl/>
+          <w:lang w:bidi="ar-MA"/>
+        </w:rPr>
+        <w:t xml:space="preserve"> بصفته أجيرا</w:t>
+      </w:r>
     </w:p>
     <w:p>
       <w:pPr>
@@ -658,32 +942,6 @@
           <w:lang w:bidi="ar-MA"/>
         </w:rPr>
       </w:pPr>
-      <w:r>
-        <w:rPr>
-          <w:rFonts w:ascii="Sakkal Majalla" w:hAnsi="Sakkal Majalla" w:cs="Sakkal Majalla"/>
-          <w:b/>
-          <w:bCs/>
-          <w:color w:val="0070C0"/>
-          <w:sz w:val="36"/>
-          <w:szCs w:val="36"/>
-          <w:rtl/>
-          <w:lang w:bidi="ar-MA"/>
-        </w:rPr>
-        <w:t>طرف ثاني</w:t>
-      </w:r>
-      <w:r>
-        <w:rPr>
-          <w:rFonts w:ascii="Sakkal Majalla" w:hAnsi="Sakkal Majalla" w:cs="Sakkal Majalla" w:hint="cs"/>
-          <w:b/>
-          <w:bCs/>
-          <w:color w:val="0070C0"/>
-          <w:sz w:val="36"/>
-          <w:szCs w:val="36"/>
-          <w:rtl/>
-          <w:lang w:bidi="ar-MA"/>
-        </w:rPr>
-        <w:t xml:space="preserve"> بصفته أجيرا</w:t>
-      </w:r>
     </w:p>
     <w:p>
       <w:pPr>
@@ -901,6 +1159,18 @@
       </w:r>
       <w:r>
         <w:rPr>
+          <w:rFonts w:ascii="Sakkal Majalla" w:hAnsi="Sakkal Majalla" w:cs="Sakkal Majalla"/>
+          <w:b/>
+          <w:bCs/>
+          <w:color w:val="0070C0"/>
+          <w:sz w:val="36"/>
+          <w:szCs w:val="36"/>
+          <w:lang w:bidi="ar-MA"/>
+        </w:rPr>
+        <w:t xml:space="preserve"> </w:t>
+      </w:r>
+      <w:r>
+        <w:rPr>
           <w:rFonts w:ascii="Sakkal Majalla" w:hAnsi="Sakkal Majalla" w:cs="Sakkal Majalla" w:hint="cs"/>
           <w:b/>
           <w:bCs/>
@@ -1037,6 +1307,18 @@
           <w:lang w:bidi="ar-MA"/>
         </w:rPr>
         <w:t>:</w:t>
+      </w:r>
+      <w:r>
+        <w:rPr>
+          <w:rFonts w:ascii="Sakkal Majalla" w:hAnsi="Sakkal Majalla" w:cs="Sakkal Majalla"/>
+          <w:b/>
+          <w:bCs/>
+          <w:color w:val="0070C0"/>
+          <w:sz w:val="36"/>
+          <w:szCs w:val="36"/>
+          <w:lang w:bidi="ar-MA"/>
+        </w:rPr>
+        <w:t xml:space="preserve"> </w:t>
       </w:r>
       <w:r>
         <w:rPr>
@@ -1310,7 +1592,70 @@
           <w:rtl/>
           <w:lang w:bidi="ar-MA"/>
         </w:rPr>
-        <w:t>الأجر المتفق عليه:  يتقاضا الأجير أجرا شهريا صافيا قدره {SALAIRE} درهم بعد خصم مستحقات الضرائب والاشتراكات الاجتماعية.</w:t>
+        <w:lastRenderedPageBreak/>
+        <w:t>الأجر المتفق عليه</w:t>
+      </w:r>
+      <w:r>
+        <w:rPr>
+          <w:rFonts w:ascii="Sakkal Majalla" w:hAnsi="Sakkal Majalla" w:cs="Sakkal Majalla"/>
+          <w:b/>
+          <w:bCs/>
+          <w:color w:val="000000" w:themeColor="text1"/>
+          <w:sz w:val="32"/>
+          <w:szCs w:val="32"/>
+          <w:rtl/>
+          <w:lang w:bidi="ar-MA"/>
+        </w:rPr>
+        <w:t xml:space="preserve">: يتقاضا الأجير أجرا شهريا صافيا قدره </w:t>
+      </w:r>
+      <w:r>
+        <w:rPr>
+          <w:rFonts w:ascii="Sakkal Majalla" w:hAnsi="Sakkal Majalla" w:cs="Sakkal Majalla"/>
+          <w:b/>
+          <w:bCs/>
+          <w:color w:val="000000" w:themeColor="text1"/>
+          <w:sz w:val="32"/>
+          <w:szCs w:val="32"/>
+          <w:lang w:bidi="ar-MA"/>
+        </w:rPr>
+        <w:t>{</w:t>
+      </w:r>
+      <w:r>
+        <w:rPr>
+          <w:rFonts w:ascii="Sakkal Majalla" w:hAnsi="Sakkal Majalla" w:cs="Sakkal Majalla"/>
+          <w:b/>
+          <w:bCs/>
+          <w:color w:val="000000" w:themeColor="text1"/>
+          <w:sz w:val="32"/>
+          <w:szCs w:val="32"/>
+          <w:lang w:bidi="ar-MA"/>
+        </w:rPr>
+        <w:t>SALAIRE</w:t>
+      </w:r>
+      <w:r>
+        <w:rPr>
+          <w:rFonts w:ascii="Sakkal Majalla" w:hAnsi="Sakkal Majalla" w:cs="Sakkal Majalla"/>
+          <w:b/>
+          <w:bCs/>
+          <w:color w:val="000000" w:themeColor="text1"/>
+          <w:sz w:val="32"/>
+          <w:szCs w:val="32"/>
+          <w:lang w:bidi="ar-MA"/>
+        </w:rPr>
+        <w:t>}</w:t>
+      </w:r>
+      <w:r>
+        <w:rPr>
+          <w:rFonts w:ascii="Sakkal Majalla" w:hAnsi="Sakkal Majalla" w:cs="Sakkal Majalla"/>
+          <w:b/>
+          <w:bCs/>
+          <w:color w:val="000000" w:themeColor="text1"/>
+          <w:sz w:val="32"/>
+          <w:szCs w:val="32"/>
+          <w:rtl/>
+          <w:lang w:bidi="ar-MA"/>
+        </w:rPr>
+        <w:t xml:space="preserve"> درهم بعد خصم مستحقات الضرائب والاشتراكات الاجتماعية.</w:t>
       </w:r>
     </w:p>
     <w:p>
@@ -1401,7 +1746,6 @@
           <w:rtl/>
           <w:lang w:bidi="ar-MA"/>
         </w:rPr>
-        <w:lastRenderedPageBreak/>
         <w:t xml:space="preserve">المادة </w:t>
       </w:r>
       <w:r>
@@ -1599,15 +1943,26 @@
       </w:r>
       <w:r>
         <w:rPr>
-          <w:rFonts w:ascii="Sakkal Majalla" w:hAnsi="Sakkal Majalla" w:cs="Sakkal Majalla" w:hint="cs"/>
-          <w:b/>
-          <w:bCs/>
-          <w:sz w:val="32"/>
-          <w:szCs w:val="32"/>
-          <w:rtl/>
-          <w:lang w:bidi="ar-MA"/>
-        </w:rPr>
-        <w:t>..../.../....</w:t>
+          <w:rFonts w:ascii="Sakkal Majalla" w:hAnsi="Sakkal Majalla" w:cs="Sakkal Majalla"/>
+          <w:b/>
+          <w:bCs/>
+          <w:sz w:val="32"/>
+          <w:szCs w:val="32"/>
+          <w:lang w:bidi="ar-MA"/>
+        </w:rPr>
+        <w:t>{DATE DEBUT DE TRAVAIL}</w:t>
+      </w:r>
+      <w:r>
+        <w:rPr>
+          <w:rFonts w:ascii="Sakkal Majalla" w:hAnsi="Sakkal Majalla" w:cs="Sakkal Majalla" w:hint="cs"/>
+          <w:b/>
+          <w:bCs/>
+          <w:sz w:val="32"/>
+          <w:szCs w:val="32"/>
+          <w:rtl/>
+          <w:lang w:bidi="ar-MA"/>
+        </w:rPr>
+        <w:t>.</w:t>
       </w:r>
     </w:p>
     <w:p>
@@ -1960,6 +2315,18 @@
       </w:r>
       <w:r>
         <w:rPr>
+          <w:rFonts w:ascii="Sakkal Majalla" w:hAnsi="Sakkal Majalla" w:cs="Sakkal Majalla"/>
+          <w:b/>
+          <w:bCs/>
+          <w:color w:val="0070C0"/>
+          <w:sz w:val="32"/>
+          <w:szCs w:val="32"/>
+          <w:lang w:bidi="ar-MA"/>
+        </w:rPr>
+        <w:t xml:space="preserve"> </w:t>
+      </w:r>
+      <w:r>
+        <w:rPr>
           <w:rFonts w:ascii="Sakkal Majalla" w:hAnsi="Sakkal Majalla" w:cs="Sakkal Majalla" w:hint="cs"/>
           <w:b/>
           <w:bCs/>
@@ -2152,6 +2519,18 @@
           <w:rFonts w:ascii="Sakkal Majalla" w:hAnsi="Sakkal Majalla" w:cs="Sakkal Majalla"/>
           <w:b/>
           <w:bCs/>
+          <w:color w:val="0070C0"/>
+          <w:sz w:val="32"/>
+          <w:szCs w:val="32"/>
+          <w:lang w:bidi="ar-MA"/>
+        </w:rPr>
+        <w:t xml:space="preserve"> </w:t>
+      </w:r>
+      <w:r>
+        <w:rPr>
+          <w:rFonts w:ascii="Sakkal Majalla" w:hAnsi="Sakkal Majalla" w:cs="Sakkal Majalla"/>
+          <w:b/>
+          <w:bCs/>
           <w:sz w:val="32"/>
           <w:szCs w:val="32"/>
           <w:rtl/>
@@ -2416,6 +2795,18 @@
           <w:lang w:bidi="ar-MA"/>
         </w:rPr>
         <w:t>:</w:t>
+      </w:r>
+      <w:r>
+        <w:rPr>
+          <w:rFonts w:ascii="Sakkal Majalla" w:hAnsi="Sakkal Majalla" w:cs="Sakkal Majalla"/>
+          <w:b/>
+          <w:bCs/>
+          <w:color w:val="0070C0"/>
+          <w:sz w:val="32"/>
+          <w:szCs w:val="32"/>
+          <w:lang w:bidi="ar-MA"/>
+        </w:rPr>
+        <w:t xml:space="preserve"> </w:t>
       </w:r>
       <w:r>
         <w:rPr>
@@ -2505,6 +2896,7 @@
           <w:rtl/>
           <w:lang w:bidi="ar-MA"/>
         </w:rPr>
+        <w:lastRenderedPageBreak/>
         <w:t xml:space="preserve">يلتزم الأجير بالتقيد </w:t>
       </w:r>
       <w:r>
@@ -2715,7 +3107,6 @@
           <w:rtl/>
           <w:lang w:bidi="ar-MA"/>
         </w:rPr>
-        <w:lastRenderedPageBreak/>
         <w:t>يلتزم الأجير بعدم اتلاف أو تبديد المواد الموضوعة رهن إشارته من طرف الشركة.</w:t>
       </w:r>
     </w:p>
@@ -3024,6 +3415,18 @@
       </w:r>
       <w:r>
         <w:rPr>
+          <w:rFonts w:ascii="Sakkal Majalla" w:hAnsi="Sakkal Majalla" w:cs="Sakkal Majalla"/>
+          <w:b/>
+          <w:bCs/>
+          <w:color w:val="0070C0"/>
+          <w:sz w:val="32"/>
+          <w:szCs w:val="32"/>
+          <w:lang w:bidi="ar-MA"/>
+        </w:rPr>
+        <w:t xml:space="preserve"> </w:t>
+      </w:r>
+      <w:r>
+        <w:rPr>
           <w:rFonts w:ascii="Sakkal Majalla" w:hAnsi="Sakkal Majalla" w:cs="Sakkal Majalla" w:hint="cs"/>
           <w:b/>
           <w:bCs/>
@@ -3178,7 +3581,19 @@
           <w:rtl/>
           <w:lang w:bidi="ar-MA"/>
         </w:rPr>
-        <w:t xml:space="preserve"> :</w:t>
+        <w:t>:</w:t>
+      </w:r>
+      <w:r>
+        <w:rPr>
+          <w:rFonts w:ascii="Sakkal Majalla" w:hAnsi="Sakkal Majalla" w:cs="Sakkal Majalla"/>
+          <w:b/>
+          <w:bCs/>
+          <w:color w:val="0070C0"/>
+          <w:sz w:val="32"/>
+          <w:szCs w:val="32"/>
+          <w:lang w:bidi="ar-MA"/>
+        </w:rPr>
+        <w:t xml:space="preserve"> </w:t>
       </w:r>
       <w:r>
         <w:rPr>
@@ -3895,6 +4310,18 @@
           <w:rFonts w:ascii="Sakkal Majalla" w:hAnsi="Sakkal Majalla" w:cs="Sakkal Majalla"/>
           <w:b/>
           <w:bCs/>
+          <w:color w:val="0070C0"/>
+          <w:sz w:val="32"/>
+          <w:szCs w:val="32"/>
+          <w:lang w:bidi="ar-MA"/>
+        </w:rPr>
+        <w:t xml:space="preserve"> </w:t>
+      </w:r>
+      <w:r>
+        <w:rPr>
+          <w:rFonts w:ascii="Sakkal Majalla" w:hAnsi="Sakkal Majalla" w:cs="Sakkal Majalla"/>
+          <w:b/>
+          <w:bCs/>
           <w:sz w:val="32"/>
           <w:szCs w:val="32"/>
           <w:rtl/>
@@ -4037,7 +4464,20 @@
           <w:rtl/>
           <w:lang w:bidi="ar-MA"/>
         </w:rPr>
-        <w:t xml:space="preserve">،  وفي حالة رفض الأجير الالتحاق فإن هذا الأمتناع يعتبر بمتابة رفض إنجاز </w:t>
+        <w:t xml:space="preserve">،  وفي حالة رفض الأجير الالتحاق فإن هذا الأمتناع </w:t>
+      </w:r>
+      <w:r>
+        <w:rPr>
+          <w:rFonts w:ascii="Sakkal Majalla" w:hAnsi="Sakkal Majalla" w:cs="Sakkal Majalla" w:hint="cs"/>
+          <w:b/>
+          <w:bCs/>
+          <w:sz w:val="32"/>
+          <w:szCs w:val="32"/>
+          <w:rtl/>
+          <w:lang w:bidi="ar-MA"/>
+        </w:rPr>
+        <w:lastRenderedPageBreak/>
+        <w:t xml:space="preserve">يعتبر بمتابة رفض إنجاز </w:t>
       </w:r>
       <w:r>
         <w:rPr>
@@ -4152,7 +4592,19 @@
           <w:rtl/>
           <w:lang w:bidi="ar-MA"/>
         </w:rPr>
-        <w:t xml:space="preserve"> :</w:t>
+        <w:t>:</w:t>
+      </w:r>
+      <w:r>
+        <w:rPr>
+          <w:rFonts w:ascii="Sakkal Majalla" w:hAnsi="Sakkal Majalla" w:cs="Sakkal Majalla"/>
+          <w:b/>
+          <w:bCs/>
+          <w:color w:val="0070C0"/>
+          <w:sz w:val="32"/>
+          <w:szCs w:val="32"/>
+          <w:lang w:bidi="ar-MA"/>
+        </w:rPr>
+        <w:t xml:space="preserve"> </w:t>
       </w:r>
       <w:r>
         <w:rPr>
@@ -4385,7 +4837,6 @@
           <w:rtl/>
           <w:lang w:bidi="ar-MA"/>
         </w:rPr>
-        <w:lastRenderedPageBreak/>
         <w:t>عند مغادرة المؤسسة لأي سبب من الأسباب، سواء بسبب الاستقالة أو الفصل من العمل ولو لم يكن مبررا، يمنع على الأجير الاشتغال لدى مشغل من نفس النشاط وذلك داخل حيز جغرافي يمتد حول محور مدين</w:t>
       </w:r>
       <w:r>
@@ -4538,25 +4989,8 @@
           <w:rtl/>
           <w:lang w:bidi="ar-MA"/>
         </w:rPr>
-        <w:t xml:space="preserve">:   </w:t>
-      </w:r>
-    </w:p>
-    <w:p>
-      <w:pPr>
-        <w:bidi/>
-        <w:spacing w:line="276" w:lineRule="auto"/>
-        <w:ind w:firstLine="339"/>
-        <w:jc w:val="both"/>
-        <w:rPr>
-          <w:rFonts w:ascii="Sakkal Majalla" w:hAnsi="Sakkal Majalla" w:cs="Sakkal Majalla"/>
-          <w:b/>
-          <w:bCs/>
-          <w:sz w:val="32"/>
-          <w:szCs w:val="32"/>
-          <w:rtl/>
-          <w:lang w:bidi="ar-MA"/>
-        </w:rPr>
-      </w:pPr>
+        <w:t xml:space="preserve">: </w:t>
+      </w:r>
       <w:r>
         <w:rPr>
           <w:rFonts w:ascii="Sakkal Majalla" w:hAnsi="Sakkal Majalla" w:cs="Sakkal Majalla" w:hint="cs"/>
@@ -4731,7 +5165,40 @@
           <w:rtl/>
           <w:lang w:bidi="ar-MA"/>
         </w:rPr>
-        <w:t>المادة الأخيرة: يشرع في سريان هذا العقد ابتداء من {DATE_EFFET}</w:t>
+        <w:t xml:space="preserve">المادة الأخيرة: يشرع في سريان هذا العقد ابتداء من </w:t>
+      </w:r>
+      <w:r>
+        <w:rPr>
+          <w:rFonts w:ascii="Sakkal Majalla" w:hAnsi="Sakkal Majalla" w:cs="Sakkal Majalla"/>
+          <w:b/>
+          <w:bCs/>
+          <w:sz w:val="32"/>
+          <w:szCs w:val="32"/>
+          <w:lang w:bidi="ar-MA"/>
+        </w:rPr>
+        <w:t>{</w:t>
+      </w:r>
+      <w:r>
+        <w:rPr>
+          <w:rFonts w:ascii="Sakkal Majalla" w:hAnsi="Sakkal Majalla" w:cs="Sakkal Majalla"/>
+          <w:b/>
+          <w:bCs/>
+          <w:sz w:val="32"/>
+          <w:szCs w:val="32"/>
+          <w:lang w:bidi="ar-MA"/>
+        </w:rPr>
+        <w:t>DATE DEBUT DE TRAVAIL</w:t>
+      </w:r>
+      <w:r>
+        <w:rPr>
+          <w:rFonts w:ascii="Sakkal Majalla" w:hAnsi="Sakkal Majalla" w:cs="Sakkal Majalla"/>
+          <w:b/>
+          <w:bCs/>
+          <w:sz w:val="32"/>
+          <w:szCs w:val="32"/>
+          <w:lang w:bidi="ar-MA"/>
+        </w:rPr>
+        <w:t>}</w:t>
       </w:r>
     </w:p>
     <w:p>
@@ -4745,21 +5212,36 @@
           <w:bCs/>
           <w:sz w:val="32"/>
           <w:szCs w:val="32"/>
-          <w:rtl/>
-          <w:lang w:bidi="ar-MA"/>
-        </w:rPr>
-      </w:pPr>
-      <w:r>
-        <w:rPr>
-          <w:rFonts w:ascii="Sakkal Majalla" w:hAnsi="Sakkal Majalla" w:cs="Sakkal Majalla" w:hint="cs"/>
-          <w:b/>
-          <w:bCs/>
-          <w:sz w:val="32"/>
-          <w:szCs w:val="32"/>
-          <w:rtl/>
-          <w:lang w:bidi="ar-MA"/>
-        </w:rPr>
-        <w:t xml:space="preserve">       حرر هذا العقد في نظيرين، يحتفظ الأجير (ة)بأحد النظيرين. </w:t>
+          <w:lang w:bidi="ar-MA"/>
+        </w:rPr>
+      </w:pPr>
+    </w:p>
+    <w:p>
+      <w:pPr>
+        <w:bidi/>
+        <w:spacing w:line="276" w:lineRule="auto"/>
+        <w:jc w:val="both"/>
+        <w:rPr>
+          <w:rFonts w:ascii="Sakkal Majalla" w:hAnsi="Sakkal Majalla" w:cs="Sakkal Majalla"/>
+          <w:b/>
+          <w:bCs/>
+          <w:sz w:val="32"/>
+          <w:szCs w:val="32"/>
+          <w:rtl/>
+          <w:lang w:bidi="ar-MA"/>
+        </w:rPr>
+      </w:pPr>
+      <w:r>
+        <w:rPr>
+          <w:rFonts w:ascii="Sakkal Majalla" w:hAnsi="Sakkal Majalla" w:cs="Sakkal Majalla" w:hint="cs"/>
+          <w:b/>
+          <w:bCs/>
+          <w:sz w:val="32"/>
+          <w:szCs w:val="32"/>
+          <w:rtl/>
+          <w:lang w:bidi="ar-MA"/>
+        </w:rPr>
+        <w:t xml:space="preserve">حرر هذا العقد في نظيرين، يحتفظ الأجير (ة)بأحد النظيرين. </w:t>
       </w:r>
     </w:p>
     <w:p>
@@ -4805,7 +5287,78 @@
           <w:rtl/>
           <w:lang w:bidi="ar-MA"/>
         </w:rPr>
-        <w:t>حرر بالرباط بتاريخ {DATE_REDACTION}</w:t>
+        <w:t>حرر بالرباط بتاريخ</w:t>
+      </w:r>
+      <w:r>
+        <w:rPr>
+          <w:rFonts w:ascii="Sakkal Majalla" w:hAnsi="Sakkal Majalla" w:hint="cs"/>
+          <w:b/>
+          <w:bCs/>
+          <w:color w:val="0070C0"/>
+          <w:sz w:val="32"/>
+          <w:szCs w:val="32"/>
+          <w:rtl/>
+          <w:lang w:bidi="ar-MA"/>
+        </w:rPr>
+        <w:t> </w:t>
+      </w:r>
+      <w:r>
+        <w:rPr>
+          <w:rFonts w:ascii="Sakkal Majalla" w:hAnsi="Sakkal Majalla" w:cs="Sakkal Majalla"/>
+          <w:b/>
+          <w:bCs/>
+          <w:color w:val="0070C0"/>
+          <w:sz w:val="32"/>
+          <w:szCs w:val="32"/>
+          <w:lang w:bidi="ar-MA"/>
+        </w:rPr>
+        <w:t>:</w:t>
+      </w:r>
+      <w:r>
+        <w:rPr>
+          <w:rFonts w:ascii="Sakkal Majalla" w:hAnsi="Sakkal Majalla" w:cs="Sakkal Majalla" w:hint="cs"/>
+          <w:b/>
+          <w:bCs/>
+          <w:color w:val="0070C0"/>
+          <w:sz w:val="32"/>
+          <w:szCs w:val="32"/>
+          <w:rtl/>
+          <w:lang w:bidi="ar-MA"/>
+        </w:rPr>
+        <w:t xml:space="preserve"> </w:t>
+      </w:r>
+      <w:r>
+        <w:rPr>
+          <w:rFonts w:ascii="Sakkal Majalla" w:hAnsi="Sakkal Majalla" w:cs="Sakkal Majalla"/>
+          <w:b/>
+          <w:bCs/>
+          <w:sz w:val="32"/>
+          <w:szCs w:val="32"/>
+          <w:lang w:bidi="ar-MA"/>
+        </w:rPr>
+        <w:t>{</w:t>
+      </w:r>
+      <w:r>
+        <w:rPr>
+          <w:rFonts w:ascii="Sakkal Majalla" w:hAnsi="Sakkal Majalla" w:cs="Sakkal Majalla"/>
+          <w:b/>
+          <w:bCs/>
+          <w:sz w:val="32"/>
+          <w:szCs w:val="32"/>
+          <w:lang w:bidi="ar-MA"/>
+        </w:rPr>
+        <w:t>DATE AUJOURD’HUI</w:t>
+      </w:r>
+      <w:r>
+        <w:rPr>
+          <w:rFonts w:ascii="Sakkal Majalla" w:hAnsi="Sakkal Majalla" w:cs="Sakkal Majalla"/>
+          <w:b/>
+          <w:bCs/>
+          <w:sz w:val="32"/>
+          <w:szCs w:val="32"/>
+          <w:lang w:bidi="ar-MA"/>
+        </w:rPr>
+        <w:t>}</w:t>
       </w:r>
     </w:p>
     <w:p>
@@ -5081,7 +5634,7 @@
         <v:path o:extrusionok="f" gradientshapeok="t" o:connecttype="rect"/>
         <o:lock v:ext="edit" aspectratio="t"/>
       </v:shapetype>
-      <v:shape id="_x0000_i1045" type="#_x0000_t75" style="width:9.7pt;height:9.7pt" o:bullet="t">
+      <v:shape id="_x0000_i1151" type="#_x0000_t75" style="width:9.7pt;height:9.7pt" o:bullet="t">
         <v:imagedata r:id="rId1" o:title="BD21294_"/>
       </v:shape>
     </w:pict>

</xml_diff>